<commit_message>
style: update signature template style
Co-Authored-By: Claude Sonnet 5 <noreply@anthropic.com>
</commit_message>
<xml_diff>
--- a/skills/dilon-document-compiler/templates/TEMPLATE_Word_Signature.docx
+++ b/skills/dilon-document-compiler/templates/TEMPLATE_Word_Signature.docx
@@ -30,21 +30,7 @@
             <w:shd w:val="clear" w:color="auto" w:fill="BFBFBF"/>
           </w:tcPr>
           <w:p>
-            <w:pPr>
-              <w:pStyle w:val="FootnoteText"/>
-              <w:jc w:val="center"/>
-              <w:rPr>
-                <w:b/>
-                <w:bCs/>
-              </w:rPr>
-            </w:pPr>
             <w:r>
-              <w:rPr>
-                <w:b/>
-                <w:bCs/>
-                <w:sz w:val="24"/>
-                <w:szCs w:val="24"/>
-              </w:rPr>
               <w:t>Group</w:t>
             </w:r>
           </w:p>
@@ -7587,13 +7573,13 @@
   <w:style w:type="paragraph" w:default="1" w:styleId="Normal">
     <w:name w:val="Normal"/>
     <w:qFormat/>
-    <w:rsid w:val="00B32420"/>
+    <w:rsid w:val="00614A84"/>
     <w:pPr>
       <w:overflowPunct w:val="0"/>
       <w:autoSpaceDE w:val="0"/>
       <w:autoSpaceDN w:val="0"/>
       <w:adjustRightInd w:val="0"/>
-      <w:spacing w:before="20" w:after="0" w:line="240" w:lineRule="auto"/>
+      <w:spacing w:after="120" w:line="240" w:lineRule="auto"/>
       <w:textAlignment w:val="baseline"/>
     </w:pPr>
     <w:rPr>
@@ -8571,7 +8557,7 @@
         <w:right w:val="single" w:sz="4" w:space="4" w:color="F5F5F5"/>
       </w:pBdr>
       <w:shd w:val="clear" w:color="auto" w:fill="F5F5F5"/>
-      <w:spacing w:before="120" w:after="120"/>
+      <w:spacing w:before="120"/>
       <w:ind w:left="360"/>
     </w:pPr>
     <w:rPr>
@@ -8902,27 +8888,6 @@
 </file>
 
 <file path=customXml/item1.xml><?xml version="1.0" encoding="utf-8"?>
-<?mso-contentType ?>
-<FormTemplates xmlns="http://schemas.microsoft.com/sharepoint/v3/contenttype/forms">
-  <Display>DocumentLibraryForm</Display>
-  <Edit>DocumentLibraryForm</Edit>
-  <New>DocumentLibraryForm</New>
-</FormTemplates>
-</file>
-
-<file path=customXml/item2.xml><?xml version="1.0" encoding="utf-8"?>
-<p:properties xmlns:p="http://schemas.microsoft.com/office/2006/metadata/properties" xmlns:xsi="http://www.w3.org/2001/XMLSchema-instance" xmlns:pc="http://schemas.microsoft.com/office/infopath/2007/PartnerControls">
-  <documentManagement>
-    <TaxCatchAll xmlns="14fbb133-db97-4d09-8590-d31f72208e11" xsi:nil="true"/>
-    <lcf76f155ced4ddcb4097134ff3c332f xmlns="ff91e89a-fa89-409e-b2c2-0afa0b8362dc">
-      <Terms xmlns="http://schemas.microsoft.com/office/infopath/2007/PartnerControls"/>
-    </lcf76f155ced4ddcb4097134ff3c332f>
-    <Index xmlns="ff91e89a-fa89-409e-b2c2-0afa0b8362dc" xsi:nil="true"/>
-  </documentManagement>
-</p:properties>
-</file>
-
-<file path=customXml/item3.xml><?xml version="1.0" encoding="utf-8"?>
 <ct:contentTypeSchema xmlns:ct="http://schemas.microsoft.com/office/2006/metadata/contentType" xmlns:ma="http://schemas.microsoft.com/office/2006/metadata/properties/metaAttributes" ct:_="" ma:_="" ma:contentTypeName="Document" ma:contentTypeID="0x01010097F8571949118944A44552DCE70F9EBD" ma:contentTypeVersion="14" ma:contentTypeDescription="Create a new document." ma:contentTypeScope="" ma:versionID="1baecbd0e49fa7b0dfe9f28182595f2e">
   <xsd:schema xmlns:xsd="http://www.w3.org/2001/XMLSchema" xmlns:xs="http://www.w3.org/2001/XMLSchema" xmlns:p="http://schemas.microsoft.com/office/2006/metadata/properties" xmlns:ns2="ff91e89a-fa89-409e-b2c2-0afa0b8362dc" xmlns:ns3="14fbb133-db97-4d09-8590-d31f72208e11" targetNamespace="http://schemas.microsoft.com/office/2006/metadata/properties" ma:root="true" ma:fieldsID="75805e7a8f6b447aa2bdfad3b9e935b1" ns2:_="" ns3:_="">
     <xsd:import namespace="ff91e89a-fa89-409e-b2c2-0afa0b8362dc"/>
@@ -9129,30 +9094,32 @@
 </ct:contentTypeSchema>
 </file>
 
+<file path=customXml/item2.xml><?xml version="1.0" encoding="utf-8"?>
+<p:properties xmlns:p="http://schemas.microsoft.com/office/2006/metadata/properties" xmlns:xsi="http://www.w3.org/2001/XMLSchema-instance" xmlns:pc="http://schemas.microsoft.com/office/infopath/2007/PartnerControls">
+  <documentManagement>
+    <TaxCatchAll xmlns="14fbb133-db97-4d09-8590-d31f72208e11" xsi:nil="true"/>
+    <lcf76f155ced4ddcb4097134ff3c332f xmlns="ff91e89a-fa89-409e-b2c2-0afa0b8362dc">
+      <Terms xmlns="http://schemas.microsoft.com/office/infopath/2007/PartnerControls"/>
+    </lcf76f155ced4ddcb4097134ff3c332f>
+    <Index xmlns="ff91e89a-fa89-409e-b2c2-0afa0b8362dc" xsi:nil="true"/>
+  </documentManagement>
+</p:properties>
+</file>
+
+<file path=customXml/item3.xml><?xml version="1.0" encoding="utf-8"?>
+<?mso-contentType ?>
+<FormTemplates xmlns="http://schemas.microsoft.com/sharepoint/v3/contenttype/forms">
+  <Display>DocumentLibraryForm</Display>
+  <Edit>DocumentLibraryForm</Edit>
+  <New>DocumentLibraryForm</New>
+</FormTemplates>
+</file>
+
 <file path=customXml/item4.xml><?xml version="1.0" encoding="utf-8"?>
 <b:Sources xmlns:b="http://schemas.openxmlformats.org/officeDocument/2006/bibliography" xmlns="http://schemas.openxmlformats.org/officeDocument/2006/bibliography" SelectedStyle="\APASixthEditionOfficeOnline.xsl" StyleName="APA" Version="6"/>
 </file>
 
 <file path=customXml/itemProps1.xml><?xml version="1.0" encoding="utf-8"?>
-<ds:datastoreItem xmlns:ds="http://schemas.openxmlformats.org/officeDocument/2006/customXml" ds:itemID="{F43CE1E5-002C-49C3-ABAF-F4181BBA83E9}">
-  <ds:schemaRefs>
-    <ds:schemaRef ds:uri="http://schemas.microsoft.com/sharepoint/v3/contenttype/forms"/>
-  </ds:schemaRefs>
-</ds:datastoreItem>
-</file>
-
-<file path=customXml/itemProps2.xml><?xml version="1.0" encoding="utf-8"?>
-<ds:datastoreItem xmlns:ds="http://schemas.openxmlformats.org/officeDocument/2006/customXml" ds:itemID="{D1B430AD-7F5E-4A6C-AC1E-18B5A5C8823C}">
-  <ds:schemaRefs>
-    <ds:schemaRef ds:uri="http://schemas.microsoft.com/office/2006/metadata/properties"/>
-    <ds:schemaRef ds:uri="http://schemas.microsoft.com/office/infopath/2007/PartnerControls"/>
-    <ds:schemaRef ds:uri="14fbb133-db97-4d09-8590-d31f72208e11"/>
-    <ds:schemaRef ds:uri="ff91e89a-fa89-409e-b2c2-0afa0b8362dc"/>
-  </ds:schemaRefs>
-</ds:datastoreItem>
-</file>
-
-<file path=customXml/itemProps3.xml><?xml version="1.0" encoding="utf-8"?>
 <ds:datastoreItem xmlns:ds="http://schemas.openxmlformats.org/officeDocument/2006/customXml" ds:itemID="{3E5D323C-384B-42D5-B47B-6F44F9FD8BE0}">
   <ds:schemaRefs>
     <ds:schemaRef ds:uri="http://schemas.microsoft.com/office/2006/metadata/contentType"/>
@@ -9171,6 +9138,25 @@
 </ds:datastoreItem>
 </file>
 
+<file path=customXml/itemProps2.xml><?xml version="1.0" encoding="utf-8"?>
+<ds:datastoreItem xmlns:ds="http://schemas.openxmlformats.org/officeDocument/2006/customXml" ds:itemID="{D1B430AD-7F5E-4A6C-AC1E-18B5A5C8823C}">
+  <ds:schemaRefs>
+    <ds:schemaRef ds:uri="http://schemas.microsoft.com/office/2006/metadata/properties"/>
+    <ds:schemaRef ds:uri="http://schemas.microsoft.com/office/infopath/2007/PartnerControls"/>
+    <ds:schemaRef ds:uri="14fbb133-db97-4d09-8590-d31f72208e11"/>
+    <ds:schemaRef ds:uri="ff91e89a-fa89-409e-b2c2-0afa0b8362dc"/>
+  </ds:schemaRefs>
+</ds:datastoreItem>
+</file>
+
+<file path=customXml/itemProps3.xml><?xml version="1.0" encoding="utf-8"?>
+<ds:datastoreItem xmlns:ds="http://schemas.openxmlformats.org/officeDocument/2006/customXml" ds:itemID="{F43CE1E5-002C-49C3-ABAF-F4181BBA83E9}">
+  <ds:schemaRefs>
+    <ds:schemaRef ds:uri="http://schemas.microsoft.com/sharepoint/v3/contenttype/forms"/>
+  </ds:schemaRefs>
+</ds:datastoreItem>
+</file>
+
 <file path=customXml/itemProps4.xml><?xml version="1.0" encoding="utf-8"?>
 <ds:datastoreItem xmlns:ds="http://schemas.openxmlformats.org/officeDocument/2006/customXml" ds:itemID="{79F96F0D-53C7-457F-BF3B-DB3D5A728589}">
   <ds:schemaRefs>

</xml_diff>

<commit_message>
style: further update signature template style
Co-Authored-By: Claude Sonnet 5 <noreply@anthropic.com>
</commit_message>
<xml_diff>
--- a/skills/dilon-document-compiler/templates/TEMPLATE_Word_Signature.docx
+++ b/skills/dilon-document-compiler/templates/TEMPLATE_Word_Signature.docx
@@ -7573,13 +7573,13 @@
   <w:style w:type="paragraph" w:default="1" w:styleId="Normal">
     <w:name w:val="Normal"/>
     <w:qFormat/>
-    <w:rsid w:val="00614A84"/>
+    <w:rsid w:val="00EE743F"/>
     <w:pPr>
       <w:overflowPunct w:val="0"/>
       <w:autoSpaceDE w:val="0"/>
       <w:autoSpaceDN w:val="0"/>
       <w:adjustRightInd w:val="0"/>
-      <w:spacing w:after="120" w:line="240" w:lineRule="auto"/>
+      <w:spacing w:before="120" w:after="120" w:line="240" w:lineRule="auto"/>
       <w:textAlignment w:val="baseline"/>
     </w:pPr>
     <w:rPr>
@@ -8557,7 +8557,6 @@
         <w:right w:val="single" w:sz="4" w:space="4" w:color="F5F5F5"/>
       </w:pBdr>
       <w:shd w:val="clear" w:color="auto" w:fill="F5F5F5"/>
-      <w:spacing w:before="120"/>
       <w:ind w:left="360"/>
     </w:pPr>
     <w:rPr>
@@ -8888,6 +8887,18 @@
 </file>
 
 <file path=customXml/item1.xml><?xml version="1.0" encoding="utf-8"?>
+<p:properties xmlns:p="http://schemas.microsoft.com/office/2006/metadata/properties" xmlns:xsi="http://www.w3.org/2001/XMLSchema-instance" xmlns:pc="http://schemas.microsoft.com/office/infopath/2007/PartnerControls">
+  <documentManagement>
+    <TaxCatchAll xmlns="14fbb133-db97-4d09-8590-d31f72208e11" xsi:nil="true"/>
+    <lcf76f155ced4ddcb4097134ff3c332f xmlns="ff91e89a-fa89-409e-b2c2-0afa0b8362dc">
+      <Terms xmlns="http://schemas.microsoft.com/office/infopath/2007/PartnerControls"/>
+    </lcf76f155ced4ddcb4097134ff3c332f>
+    <Index xmlns="ff91e89a-fa89-409e-b2c2-0afa0b8362dc" xsi:nil="true"/>
+  </documentManagement>
+</p:properties>
+</file>
+
+<file path=customXml/item2.xml><?xml version="1.0" encoding="utf-8"?>
 <ct:contentTypeSchema xmlns:ct="http://schemas.microsoft.com/office/2006/metadata/contentType" xmlns:ma="http://schemas.microsoft.com/office/2006/metadata/properties/metaAttributes" ct:_="" ma:_="" ma:contentTypeName="Document" ma:contentTypeID="0x01010097F8571949118944A44552DCE70F9EBD" ma:contentTypeVersion="14" ma:contentTypeDescription="Create a new document." ma:contentTypeScope="" ma:versionID="1baecbd0e49fa7b0dfe9f28182595f2e">
   <xsd:schema xmlns:xsd="http://www.w3.org/2001/XMLSchema" xmlns:xs="http://www.w3.org/2001/XMLSchema" xmlns:p="http://schemas.microsoft.com/office/2006/metadata/properties" xmlns:ns2="ff91e89a-fa89-409e-b2c2-0afa0b8362dc" xmlns:ns3="14fbb133-db97-4d09-8590-d31f72208e11" targetNamespace="http://schemas.microsoft.com/office/2006/metadata/properties" ma:root="true" ma:fieldsID="75805e7a8f6b447aa2bdfad3b9e935b1" ns2:_="" ns3:_="">
     <xsd:import namespace="ff91e89a-fa89-409e-b2c2-0afa0b8362dc"/>
@@ -9094,19 +9105,11 @@
 </ct:contentTypeSchema>
 </file>
 
-<file path=customXml/item2.xml><?xml version="1.0" encoding="utf-8"?>
-<p:properties xmlns:p="http://schemas.microsoft.com/office/2006/metadata/properties" xmlns:xsi="http://www.w3.org/2001/XMLSchema-instance" xmlns:pc="http://schemas.microsoft.com/office/infopath/2007/PartnerControls">
-  <documentManagement>
-    <TaxCatchAll xmlns="14fbb133-db97-4d09-8590-d31f72208e11" xsi:nil="true"/>
-    <lcf76f155ced4ddcb4097134ff3c332f xmlns="ff91e89a-fa89-409e-b2c2-0afa0b8362dc">
-      <Terms xmlns="http://schemas.microsoft.com/office/infopath/2007/PartnerControls"/>
-    </lcf76f155ced4ddcb4097134ff3c332f>
-    <Index xmlns="ff91e89a-fa89-409e-b2c2-0afa0b8362dc" xsi:nil="true"/>
-  </documentManagement>
-</p:properties>
+<file path=customXml/item3.xml><?xml version="1.0" encoding="utf-8"?>
+<b:Sources xmlns:b="http://schemas.openxmlformats.org/officeDocument/2006/bibliography" xmlns="http://schemas.openxmlformats.org/officeDocument/2006/bibliography" SelectedStyle="\APASixthEditionOfficeOnline.xsl" StyleName="APA" Version="6"/>
 </file>
 
-<file path=customXml/item3.xml><?xml version="1.0" encoding="utf-8"?>
+<file path=customXml/item4.xml><?xml version="1.0" encoding="utf-8"?>
 <?mso-contentType ?>
 <FormTemplates xmlns="http://schemas.microsoft.com/sharepoint/v3/contenttype/forms">
   <Display>DocumentLibraryForm</Display>
@@ -9115,11 +9118,18 @@
 </FormTemplates>
 </file>
 
-<file path=customXml/item4.xml><?xml version="1.0" encoding="utf-8"?>
-<b:Sources xmlns:b="http://schemas.openxmlformats.org/officeDocument/2006/bibliography" xmlns="http://schemas.openxmlformats.org/officeDocument/2006/bibliography" SelectedStyle="\APASixthEditionOfficeOnline.xsl" StyleName="APA" Version="6"/>
+<file path=customXml/itemProps1.xml><?xml version="1.0" encoding="utf-8"?>
+<ds:datastoreItem xmlns:ds="http://schemas.openxmlformats.org/officeDocument/2006/customXml" ds:itemID="{D1B430AD-7F5E-4A6C-AC1E-18B5A5C8823C}">
+  <ds:schemaRefs>
+    <ds:schemaRef ds:uri="http://schemas.microsoft.com/office/2006/metadata/properties"/>
+    <ds:schemaRef ds:uri="http://schemas.microsoft.com/office/infopath/2007/PartnerControls"/>
+    <ds:schemaRef ds:uri="14fbb133-db97-4d09-8590-d31f72208e11"/>
+    <ds:schemaRef ds:uri="ff91e89a-fa89-409e-b2c2-0afa0b8362dc"/>
+  </ds:schemaRefs>
+</ds:datastoreItem>
 </file>
 
-<file path=customXml/itemProps1.xml><?xml version="1.0" encoding="utf-8"?>
+<file path=customXml/itemProps2.xml><?xml version="1.0" encoding="utf-8"?>
 <ds:datastoreItem xmlns:ds="http://schemas.openxmlformats.org/officeDocument/2006/customXml" ds:itemID="{3E5D323C-384B-42D5-B47B-6F44F9FD8BE0}">
   <ds:schemaRefs>
     <ds:schemaRef ds:uri="http://schemas.microsoft.com/office/2006/metadata/contentType"/>
@@ -9138,29 +9148,18 @@
 </ds:datastoreItem>
 </file>
 
-<file path=customXml/itemProps2.xml><?xml version="1.0" encoding="utf-8"?>
-<ds:datastoreItem xmlns:ds="http://schemas.openxmlformats.org/officeDocument/2006/customXml" ds:itemID="{D1B430AD-7F5E-4A6C-AC1E-18B5A5C8823C}">
+<file path=customXml/itemProps3.xml><?xml version="1.0" encoding="utf-8"?>
+<ds:datastoreItem xmlns:ds="http://schemas.openxmlformats.org/officeDocument/2006/customXml" ds:itemID="{79F96F0D-53C7-457F-BF3B-DB3D5A728589}">
   <ds:schemaRefs>
-    <ds:schemaRef ds:uri="http://schemas.microsoft.com/office/2006/metadata/properties"/>
-    <ds:schemaRef ds:uri="http://schemas.microsoft.com/office/infopath/2007/PartnerControls"/>
-    <ds:schemaRef ds:uri="14fbb133-db97-4d09-8590-d31f72208e11"/>
-    <ds:schemaRef ds:uri="ff91e89a-fa89-409e-b2c2-0afa0b8362dc"/>
+    <ds:schemaRef ds:uri="http://schemas.openxmlformats.org/officeDocument/2006/bibliography"/>
   </ds:schemaRefs>
 </ds:datastoreItem>
 </file>
 
-<file path=customXml/itemProps3.xml><?xml version="1.0" encoding="utf-8"?>
+<file path=customXml/itemProps4.xml><?xml version="1.0" encoding="utf-8"?>
 <ds:datastoreItem xmlns:ds="http://schemas.openxmlformats.org/officeDocument/2006/customXml" ds:itemID="{F43CE1E5-002C-49C3-ABAF-F4181BBA83E9}">
   <ds:schemaRefs>
     <ds:schemaRef ds:uri="http://schemas.microsoft.com/sharepoint/v3/contenttype/forms"/>
   </ds:schemaRefs>
 </ds:datastoreItem>
-</file>
-
-<file path=customXml/itemProps4.xml><?xml version="1.0" encoding="utf-8"?>
-<ds:datastoreItem xmlns:ds="http://schemas.openxmlformats.org/officeDocument/2006/customXml" ds:itemID="{79F96F0D-53C7-457F-BF3B-DB3D5A728589}">
-  <ds:schemaRefs>
-    <ds:schemaRef ds:uri="http://schemas.openxmlformats.org/officeDocument/2006/bibliography"/>
-  </ds:schemaRefs>
-</ds:datastoreItem>
 </file>
</xml_diff>

<commit_message>
style: update signature template
Co-Authored-By: Claude Sonnet 5 <noreply@anthropic.com>
</commit_message>
<xml_diff>
--- a/skills/dilon-document-compiler/templates/TEMPLATE_Word_Signature.docx
+++ b/skills/dilon-document-compiler/templates/TEMPLATE_Word_Signature.docx
@@ -30,7 +30,18 @@
             <w:shd w:val="clear" w:color="auto" w:fill="BFBFBF"/>
           </w:tcPr>
           <w:p>
+            <w:pPr>
+              <w:jc w:val="center"/>
+              <w:rPr>
+                <w:b/>
+                <w:bCs/>
+              </w:rPr>
+            </w:pPr>
             <w:r>
+              <w:rPr>
+                <w:b/>
+                <w:bCs/>
+              </w:rPr>
               <w:t>Group</w:t>
             </w:r>
           </w:p>
@@ -9065,15 +9076,7 @@
 </file>
 
 <file path=customXml/item1.xml><?xml version="1.0" encoding="utf-8"?>
-<p:properties xmlns:p="http://schemas.microsoft.com/office/2006/metadata/properties" xmlns:xsi="http://www.w3.org/2001/XMLSchema-instance" xmlns:pc="http://schemas.microsoft.com/office/infopath/2007/PartnerControls">
-  <documentManagement>
-    <TaxCatchAll xmlns="14fbb133-db97-4d09-8590-d31f72208e11" xsi:nil="true"/>
-    <lcf76f155ced4ddcb4097134ff3c332f xmlns="ff91e89a-fa89-409e-b2c2-0afa0b8362dc">
-      <Terms xmlns="http://schemas.microsoft.com/office/infopath/2007/PartnerControls"/>
-    </lcf76f155ced4ddcb4097134ff3c332f>
-    <Index xmlns="ff91e89a-fa89-409e-b2c2-0afa0b8362dc" xsi:nil="true"/>
-  </documentManagement>
-</p:properties>
+<b:Sources xmlns:b="http://schemas.openxmlformats.org/officeDocument/2006/bibliography" xmlns="http://schemas.openxmlformats.org/officeDocument/2006/bibliography" SelectedStyle="\APASixthEditionOfficeOnline.xsl" StyleName="APA" Version="6"/>
 </file>
 
 <file path=customXml/item2.xml><?xml version="1.0" encoding="utf-8"?>
@@ -9284,7 +9287,15 @@
 </file>
 
 <file path=customXml/item3.xml><?xml version="1.0" encoding="utf-8"?>
-<b:Sources xmlns:b="http://schemas.openxmlformats.org/officeDocument/2006/bibliography" xmlns="http://schemas.openxmlformats.org/officeDocument/2006/bibliography" SelectedStyle="\APASixthEditionOfficeOnline.xsl" StyleName="APA" Version="6"/>
+<p:properties xmlns:p="http://schemas.microsoft.com/office/2006/metadata/properties" xmlns:xsi="http://www.w3.org/2001/XMLSchema-instance" xmlns:pc="http://schemas.microsoft.com/office/infopath/2007/PartnerControls">
+  <documentManagement>
+    <TaxCatchAll xmlns="14fbb133-db97-4d09-8590-d31f72208e11" xsi:nil="true"/>
+    <lcf76f155ced4ddcb4097134ff3c332f xmlns="ff91e89a-fa89-409e-b2c2-0afa0b8362dc">
+      <Terms xmlns="http://schemas.microsoft.com/office/infopath/2007/PartnerControls"/>
+    </lcf76f155ced4ddcb4097134ff3c332f>
+    <Index xmlns="ff91e89a-fa89-409e-b2c2-0afa0b8362dc" xsi:nil="true"/>
+  </documentManagement>
+</p:properties>
 </file>
 
 <file path=customXml/item4.xml><?xml version="1.0" encoding="utf-8"?>
@@ -9297,12 +9308,9 @@
 </file>
 
 <file path=customXml/itemProps1.xml><?xml version="1.0" encoding="utf-8"?>
-<ds:datastoreItem xmlns:ds="http://schemas.openxmlformats.org/officeDocument/2006/customXml" ds:itemID="{D1B430AD-7F5E-4A6C-AC1E-18B5A5C8823C}">
+<ds:datastoreItem xmlns:ds="http://schemas.openxmlformats.org/officeDocument/2006/customXml" ds:itemID="{79F96F0D-53C7-457F-BF3B-DB3D5A728589}">
   <ds:schemaRefs>
-    <ds:schemaRef ds:uri="http://schemas.microsoft.com/office/2006/metadata/properties"/>
-    <ds:schemaRef ds:uri="http://schemas.microsoft.com/office/infopath/2007/PartnerControls"/>
-    <ds:schemaRef ds:uri="14fbb133-db97-4d09-8590-d31f72208e11"/>
-    <ds:schemaRef ds:uri="ff91e89a-fa89-409e-b2c2-0afa0b8362dc"/>
+    <ds:schemaRef ds:uri="http://schemas.openxmlformats.org/officeDocument/2006/bibliography"/>
   </ds:schemaRefs>
 </ds:datastoreItem>
 </file>
@@ -9327,9 +9335,12 @@
 </file>
 
 <file path=customXml/itemProps3.xml><?xml version="1.0" encoding="utf-8"?>
-<ds:datastoreItem xmlns:ds="http://schemas.openxmlformats.org/officeDocument/2006/customXml" ds:itemID="{79F96F0D-53C7-457F-BF3B-DB3D5A728589}">
+<ds:datastoreItem xmlns:ds="http://schemas.openxmlformats.org/officeDocument/2006/customXml" ds:itemID="{D1B430AD-7F5E-4A6C-AC1E-18B5A5C8823C}">
   <ds:schemaRefs>
-    <ds:schemaRef ds:uri="http://schemas.openxmlformats.org/officeDocument/2006/bibliography"/>
+    <ds:schemaRef ds:uri="http://schemas.microsoft.com/office/2006/metadata/properties"/>
+    <ds:schemaRef ds:uri="http://schemas.microsoft.com/office/infopath/2007/PartnerControls"/>
+    <ds:schemaRef ds:uri="14fbb133-db97-4d09-8590-d31f72208e11"/>
+    <ds:schemaRef ds:uri="ff91e89a-fa89-409e-b2c2-0afa0b8362dc"/>
   </ds:schemaRefs>
 </ds:datastoreItem>
 </file>

</xml_diff>